<commit_message>
feat: Archivos adjuntos y firmas agregadas
</commit_message>
<xml_diff>
--- a/docs/Formulario.docx
+++ b/docs/Formulario.docx
@@ -4095,6 +4095,7 @@
         <w:ind/>
         <w:rPr>
           <w:rFonts w:ascii="Arial" w:hAnsi="Arial" w:cs="Arial"/>
+          <w:highlight w:val="none"/>
           <w:lang w:val="es-VE"/>
         </w:rPr>
       </w:pPr>
@@ -4120,6 +4121,372 @@
         </w:rPr>
         <w:br/>
         <w:t xml:space="preserve">¿Cuáles? ________________________________________________________</w:t>
+      </w:r>
+      <w:r>
+        <w:rPr>
+          <w:rFonts w:ascii="Arial" w:hAnsi="Arial" w:cs="Arial"/>
+          <w:lang w:val="es-VE"/>
+        </w:rPr>
+      </w:r>
+      <w:r>
+        <w:rPr>
+          <w:rFonts w:ascii="Arial" w:hAnsi="Arial" w:cs="Arial"/>
+          <w:lang w:val="es-VE"/>
+        </w:rPr>
+      </w:r>
+      <w:r>
+        <w:rPr>
+          <w:rFonts w:ascii="Arial" w:hAnsi="Arial" w:cs="Arial"/>
+          <w:lang w:val="es-VE"/>
+        </w:rPr>
+      </w:r>
+    </w:p>
+    <w:p>
+      <w:pPr>
+        <w:pStyle w:val="891"/>
+        <w:pBdr/>
+        <w:spacing/>
+        <w:ind/>
+        <w:rPr>
+          <w:rFonts w:ascii="Arial" w:hAnsi="Arial" w:cs="Arial"/>
+          <w:lang w:val="es-VE"/>
+        </w:rPr>
+      </w:pPr>
+      <w:r>
+        <w:rPr>
+          <w:rFonts w:ascii="Arial" w:hAnsi="Arial" w:cs="Arial"/>
+          <w:highlight w:val="none"/>
+          <w:lang w:val="es-VE" w:bidi="es-VE"/>
+        </w:rPr>
+      </w:r>
+      <w:r>
+        <w:rPr>
+          <w:rFonts w:ascii="Arial" w:hAnsi="Arial" w:cs="Arial"/>
+          <w:highlight w:val="none"/>
+          <w:lang w:val="es-VE" w:bidi="es-VE"/>
+        </w:rPr>
+      </w:r>
+      <w:r>
+        <w:rPr>
+          <w:rFonts w:ascii="Arial" w:hAnsi="Arial" w:cs="Arial"/>
+          <w:highlight w:val="none"/>
+          <w:lang w:val="es-VE"/>
+        </w:rPr>
+      </w:r>
+    </w:p>
+    <w:p>
+      <w:pPr>
+        <w:pStyle w:val="891"/>
+        <w:pBdr/>
+        <w:spacing/>
+        <w:ind/>
+        <w:rPr>
+          <w:rFonts w:ascii="Arial" w:hAnsi="Arial" w:cs="Arial"/>
+          <w:b/>
+          <w:bCs/>
+        </w:rPr>
+      </w:pPr>
+      <w:r>
+        <w:rPr>
+          <w:rFonts w:ascii="Arial" w:hAnsi="Arial" w:cs="Arial"/>
+          <w:b/>
+          <w:bCs/>
+          <w:lang w:val="es-VE"/>
+        </w:rPr>
+        <w:t xml:space="preserve">SECCIÓN J</w:t>
+      </w:r>
+      <w:r>
+        <w:rPr>
+          <w:rFonts w:ascii="Arial" w:hAnsi="Arial" w:cs="Arial"/>
+          <w:b/>
+          <w:bCs/>
+          <w:lang w:val="es-VE"/>
+        </w:rPr>
+        <w:t xml:space="preserve">. DOCUMENTOS ANEXOS (marque los que adjunta)</w:t>
+      </w:r>
+      <w:r>
+        <w:rPr>
+          <w:rFonts w:ascii="Arial" w:hAnsi="Arial" w:cs="Arial"/>
+          <w:b/>
+          <w:bCs/>
+          <w:lang w:val="es-VE"/>
+        </w:rPr>
+        <w:br/>
+      </w:r>
+      <w:r>
+        <w:rPr>
+          <w:rFonts w:ascii="Arial" w:hAnsi="Arial" w:cs="Arial"/>
+          <w:b/>
+          <w:bCs/>
+          <w:lang w:val="es-VE"/>
+        </w:rPr>
+      </w:r>
+      <w:r>
+        <w:rPr>
+          <w:rFonts w:ascii="Arial" w:hAnsi="Arial" w:cs="Arial"/>
+          <w:b/>
+          <w:bCs/>
+          <w:lang w:val="es-VE"/>
+        </w:rPr>
+      </w:r>
+    </w:p>
+    <w:p>
+      <w:pPr>
+        <w:pStyle w:val="891"/>
+        <w:pBdr/>
+        <w:spacing/>
+        <w:ind/>
+        <w:rPr>
+          <w:rFonts w:ascii="Arial" w:hAnsi="Arial" w:cs="Arial"/>
+          <w:lang w:val="es-VE"/>
+        </w:rPr>
+      </w:pPr>
+      <w:r>
+        <w:rPr>
+          <w:rFonts w:ascii="Arial" w:hAnsi="Arial" w:cs="Arial"/>
+          <w:lang w:val="es-VE"/>
+        </w:rPr>
+        <w:t xml:space="preserve">( ) Fotografías del espacio físico</w:t>
+      </w:r>
+      <w:r>
+        <w:rPr>
+          <w:rFonts w:ascii="Arial" w:hAnsi="Arial" w:cs="Arial"/>
+          <w:lang w:val="es-VE"/>
+        </w:rPr>
+        <w:br/>
+        <w:t xml:space="preserve">( ) Fotografías del equipamiento</w:t>
+      </w:r>
+      <w:r>
+        <w:rPr>
+          <w:rFonts w:ascii="Arial" w:hAnsi="Arial" w:cs="Arial"/>
+          <w:lang w:val="es-VE"/>
+        </w:rPr>
+        <w:br/>
+        <w:t xml:space="preserve">( ) Convenio de articulación con Sala de Autogobierno (si aplica)</w:t>
+      </w:r>
+      <w:r>
+        <w:rPr>
+          <w:rFonts w:ascii="Arial" w:hAnsi="Arial" w:cs="Arial"/>
+          <w:lang w:val="es-VE"/>
+        </w:rPr>
+        <w:br/>
+        <w:t xml:space="preserve">( ) Plan de actividades del </w:t>
+      </w:r>
+      <w:r>
+        <w:rPr>
+          <w:rFonts w:ascii="Arial" w:hAnsi="Arial" w:cs="Arial"/>
+          <w:lang w:val="es-VE"/>
+        </w:rPr>
+        <w:t xml:space="preserve">infocentro</w:t>
+      </w:r>
+      <w:r>
+        <w:rPr>
+          <w:rFonts w:ascii="Arial" w:hAnsi="Arial" w:cs="Arial"/>
+          <w:lang w:val="es-VE"/>
+        </w:rPr>
+        <w:t xml:space="preserve"> (si existe)</w:t>
+      </w:r>
+      <w:r>
+        <w:rPr>
+          <w:rFonts w:ascii="Arial" w:hAnsi="Arial" w:cs="Arial"/>
+          <w:lang w:val="es-VE"/>
+        </w:rPr>
+        <w:br/>
+        <w:t xml:space="preserve">( ) Listado de participantes en actividades recientes</w:t>
+      </w:r>
+      <w:r>
+        <w:rPr>
+          <w:rFonts w:ascii="Arial" w:hAnsi="Arial" w:cs="Arial"/>
+          <w:lang w:val="es-VE"/>
+        </w:rPr>
+        <w:br/>
+        <w:t xml:space="preserve">( ) Otros: ________________________________________________________</w:t>
+      </w:r>
+      <w:r>
+        <w:rPr>
+          <w:rFonts w:ascii="Arial" w:hAnsi="Arial" w:cs="Arial"/>
+          <w:lang w:val="es-VE"/>
+        </w:rPr>
+      </w:r>
+      <w:r>
+        <w:rPr>
+          <w:rFonts w:ascii="Arial" w:hAnsi="Arial" w:cs="Arial"/>
+          <w:lang w:val="es-VE"/>
+        </w:rPr>
+      </w:r>
+    </w:p>
+    <w:p>
+      <w:pPr>
+        <w:pStyle w:val="891"/>
+        <w:pBdr/>
+        <w:spacing/>
+        <w:ind/>
+        <w:rPr>
+          <w:rFonts w:ascii="Arial" w:hAnsi="Arial" w:cs="Arial"/>
+        </w:rPr>
+      </w:pPr>
+      <w:r>
+        <w:rPr>
+          <w:rFonts w:ascii="Arial" w:hAnsi="Arial" w:cs="Arial"/>
+        </w:rPr>
+        <w:t xml:space="preserve">--------------------------------------------------------------------------------</w:t>
+      </w:r>
+      <w:r>
+        <w:rPr>
+          <w:rFonts w:ascii="Arial" w:hAnsi="Arial" w:cs="Arial"/>
+        </w:rPr>
+        <w:br/>
+        <w:t xml:space="preserve">FIRMAS</w:t>
+      </w:r>
+      <w:r>
+        <w:rPr>
+          <w:rFonts w:ascii="Arial" w:hAnsi="Arial" w:cs="Arial"/>
+        </w:rPr>
+        <w:br/>
+        <w:t xml:space="preserve">--------------------------------------------------------------------------------</w:t>
+      </w:r>
+      <w:r>
+        <w:rPr>
+          <w:rFonts w:ascii="Arial" w:hAnsi="Arial" w:cs="Arial"/>
+        </w:rPr>
+      </w:r>
+      <w:r>
+        <w:rPr>
+          <w:rFonts w:ascii="Arial" w:hAnsi="Arial" w:cs="Arial"/>
+        </w:rPr>
+      </w:r>
+    </w:p>
+    <w:p>
+      <w:pPr>
+        <w:pStyle w:val="891"/>
+        <w:pBdr/>
+        <w:spacing/>
+        <w:ind/>
+        <w:rPr>
+          <w:rFonts w:ascii="Arial" w:hAnsi="Arial" w:cs="Arial"/>
+          <w:lang w:val="es-VE"/>
+        </w:rPr>
+      </w:pPr>
+      <w:r>
+        <w:rPr>
+          <w:rFonts w:ascii="Arial" w:hAnsi="Arial" w:cs="Arial"/>
+          <w:lang w:val="es-VE"/>
+        </w:rPr>
+        <w:t xml:space="preserve">Diagnosticador</w:t>
+      </w:r>
+      <w:r>
+        <w:rPr>
+          <w:rFonts w:ascii="Arial" w:hAnsi="Arial" w:cs="Arial"/>
+          <w:lang w:val="es-VE"/>
+        </w:rPr>
+        <w:t xml:space="preserve">: _____________________________ Firma: _______________ Fecha: _______</w:t>
+      </w:r>
+      <w:r>
+        <w:rPr>
+          <w:rFonts w:ascii="Arial" w:hAnsi="Arial" w:cs="Arial"/>
+          <w:lang w:val="es-VE"/>
+        </w:rPr>
+      </w:r>
+      <w:r>
+        <w:rPr>
+          <w:rFonts w:ascii="Arial" w:hAnsi="Arial" w:cs="Arial"/>
+          <w:lang w:val="es-VE"/>
+        </w:rPr>
+      </w:r>
+    </w:p>
+    <w:p>
+      <w:pPr>
+        <w:pStyle w:val="891"/>
+        <w:pBdr/>
+        <w:spacing/>
+        <w:ind/>
+        <w:rPr>
+          <w:rFonts w:ascii="Arial" w:hAnsi="Arial" w:cs="Arial"/>
+          <w:lang w:val="es-VE"/>
+        </w:rPr>
+      </w:pPr>
+      <w:r>
+        <w:rPr>
+          <w:rFonts w:ascii="Arial" w:hAnsi="Arial" w:cs="Arial"/>
+          <w:lang w:val="es-VE"/>
+        </w:rPr>
+        <w:t xml:space="preserve">Facilitador/a del </w:t>
+      </w:r>
+      <w:r>
+        <w:rPr>
+          <w:rFonts w:ascii="Arial" w:hAnsi="Arial" w:cs="Arial"/>
+          <w:lang w:val="es-VE"/>
+        </w:rPr>
+        <w:t xml:space="preserve">Infocentro</w:t>
+      </w:r>
+      <w:r>
+        <w:rPr>
+          <w:rFonts w:ascii="Arial" w:hAnsi="Arial" w:cs="Arial"/>
+          <w:lang w:val="es-VE"/>
+        </w:rPr>
+        <w:t xml:space="preserve">: _______________ Firma: _______________ Fecha: _______</w:t>
+      </w:r>
+      <w:r>
+        <w:rPr>
+          <w:rFonts w:ascii="Arial" w:hAnsi="Arial" w:cs="Arial"/>
+          <w:lang w:val="es-VE"/>
+        </w:rPr>
+      </w:r>
+      <w:r>
+        <w:rPr>
+          <w:rFonts w:ascii="Arial" w:hAnsi="Arial" w:cs="Arial"/>
+          <w:lang w:val="es-VE"/>
+        </w:rPr>
+      </w:r>
+    </w:p>
+    <w:p>
+      <w:pPr>
+        <w:pStyle w:val="891"/>
+        <w:pBdr/>
+        <w:spacing/>
+        <w:ind/>
+        <w:rPr>
+          <w:rFonts w:ascii="Arial" w:hAnsi="Arial" w:cs="Arial"/>
+          <w:lang w:val="es-VE"/>
+        </w:rPr>
+      </w:pPr>
+      <w:r>
+        <w:rPr>
+          <w:rFonts w:ascii="Arial" w:hAnsi="Arial" w:cs="Arial"/>
+          <w:lang w:val="es-VE"/>
+        </w:rPr>
+        <w:t xml:space="preserve">Vocero/a Sala de Autogobierno Comunal: _______ Firma: _______________ Fecha: _______</w:t>
+      </w:r>
+      <w:r>
+        <w:rPr>
+          <w:rFonts w:ascii="Arial" w:hAnsi="Arial" w:cs="Arial"/>
+          <w:lang w:val="es-VE"/>
+        </w:rPr>
+      </w:r>
+      <w:r>
+        <w:rPr>
+          <w:rFonts w:ascii="Arial" w:hAnsi="Arial" w:cs="Arial"/>
+          <w:lang w:val="es-VE"/>
+        </w:rPr>
+      </w:r>
+    </w:p>
+    <w:p>
+      <w:pPr>
+        <w:pStyle w:val="891"/>
+        <w:pBdr/>
+        <w:spacing/>
+        <w:ind/>
+        <w:rPr>
+          <w:rFonts w:ascii="Arial" w:hAnsi="Arial" w:cs="Arial"/>
+          <w:lang w:val="es-VE"/>
+        </w:rPr>
+      </w:pPr>
+      <w:r>
+        <w:rPr>
+          <w:rFonts w:ascii="Arial" w:hAnsi="Arial" w:cs="Arial"/>
+          <w:lang w:val="es-VE"/>
+        </w:rPr>
+        <w:t xml:space="preserve">Representante Consejo Comunal: ______________ Firma: _______________ Fecha: _______</w:t>
       </w:r>
       <w:r>
         <w:rPr>

</xml_diff>

<commit_message>
feat: Anadiendo clasificacion de infocentros
</commit_message>
<xml_diff>
--- a/docs/Formulario.docx
+++ b/docs/Formulario.docx
@@ -4487,6 +4487,915 @@
           <w:lang w:val="es-VE"/>
         </w:rPr>
         <w:t xml:space="preserve">Representante Consejo Comunal: ______________ Firma: _______________ Fecha: _______</w:t>
+      </w:r>
+      <w:r>
+        <w:rPr>
+          <w:rFonts w:ascii="Arial" w:hAnsi="Arial" w:cs="Arial"/>
+          <w:lang w:val="es-VE"/>
+        </w:rPr>
+      </w:r>
+      <w:r>
+        <w:rPr>
+          <w:rFonts w:ascii="Arial" w:hAnsi="Arial" w:cs="Arial"/>
+          <w:lang w:val="es-VE"/>
+        </w:rPr>
+      </w:r>
+    </w:p>
+    <w:p>
+      <w:pPr>
+        <w:pBdr/>
+        <w:spacing/>
+        <w:ind/>
+        <w:rPr/>
+      </w:pPr>
+      <w:r/>
+      <w:r/>
+      <w:r/>
+    </w:p>
+    <w:p>
+      <w:pPr>
+        <w:pStyle w:val="891"/>
+        <w:pBdr/>
+        <w:spacing/>
+        <w:ind/>
+        <w:rPr>
+          <w:rFonts w:ascii="Arial" w:hAnsi="Arial" w:cs="Arial"/>
+          <w:lang w:val="es-VE"/>
+        </w:rPr>
+      </w:pPr>
+      <w:r>
+        <w:rPr>
+          <w:rFonts w:ascii="Arial" w:hAnsi="Arial" w:cs="Arial"/>
+          <w:b/>
+          <w:lang w:val="es-VE"/>
+        </w:rPr>
+        <w:t xml:space="preserve">PERFILAMIENTO Y CLASIFICACIÓN DEL INFOCENTRO</w:t>
+      </w:r>
+      <w:r>
+        <w:rPr>
+          <w:rFonts w:ascii="Arial" w:hAnsi="Arial" w:cs="Arial"/>
+          <w:b/>
+          <w:lang w:val="es-VE"/>
+        </w:rPr>
+        <w:br/>
+      </w:r>
+      <w:r>
+        <w:rPr>
+          <w:rFonts w:ascii="Arial" w:hAnsi="Arial" w:cs="Arial"/>
+          <w:lang w:val="es-VE"/>
+        </w:rPr>
+        <w:t xml:space="preserve">Esta sección debe ser llenada por el </w:t>
+      </w:r>
+      <w:r>
+        <w:rPr>
+          <w:rFonts w:ascii="Arial" w:hAnsi="Arial" w:cs="Arial"/>
+          <w:lang w:val="es-VE"/>
+        </w:rPr>
+        <w:t xml:space="preserve">diagnosticador</w:t>
+      </w:r>
+      <w:r>
+        <w:rPr>
+          <w:rFonts w:ascii="Arial" w:hAnsi="Arial" w:cs="Arial"/>
+          <w:lang w:val="es-VE"/>
+        </w:rPr>
+        <w:t xml:space="preserve"> con base en la información</w:t>
+      </w:r>
+      <w:r>
+        <w:rPr>
+          <w:rFonts w:ascii="Arial" w:hAnsi="Arial" w:cs="Arial"/>
+          <w:lang w:val="es-VE"/>
+        </w:rPr>
+        <w:br/>
+        <w:t xml:space="preserve">recabada en las secciones anteriores.</w:t>
+      </w:r>
+      <w:r>
+        <w:rPr>
+          <w:rFonts w:ascii="Arial" w:hAnsi="Arial" w:cs="Arial"/>
+          <w:lang w:val="es-VE"/>
+        </w:rPr>
+      </w:r>
+      <w:r>
+        <w:rPr>
+          <w:rFonts w:ascii="Arial" w:hAnsi="Arial" w:cs="Arial"/>
+          <w:lang w:val="es-VE"/>
+        </w:rPr>
+      </w:r>
+    </w:p>
+    <w:p>
+      <w:pPr>
+        <w:pStyle w:val="891"/>
+        <w:pBdr/>
+        <w:spacing/>
+        <w:ind/>
+        <w:rPr>
+          <w:rFonts w:ascii="Arial" w:hAnsi="Arial" w:cs="Arial"/>
+          <w:lang w:val="es-VE"/>
+        </w:rPr>
+      </w:pPr>
+      <w:r>
+        <w:rPr>
+          <w:rFonts w:ascii="Arial" w:hAnsi="Arial" w:cs="Arial"/>
+          <w:lang w:val="es-VE"/>
+        </w:rPr>
+        <w:t xml:space="preserve">PUNTUACIÓN POR DIMENSIONES (asigne 0 a 3 puntos por dimensión)</w:t>
+      </w:r>
+      <w:r>
+        <w:rPr>
+          <w:rFonts w:ascii="Arial" w:hAnsi="Arial" w:cs="Arial"/>
+          <w:lang w:val="es-VE"/>
+        </w:rPr>
+      </w:r>
+      <w:r>
+        <w:rPr>
+          <w:rFonts w:ascii="Arial" w:hAnsi="Arial" w:cs="Arial"/>
+          <w:lang w:val="es-VE"/>
+        </w:rPr>
+      </w:r>
+    </w:p>
+    <w:p>
+      <w:pPr>
+        <w:pStyle w:val="891"/>
+        <w:pBdr/>
+        <w:spacing/>
+        <w:ind/>
+        <w:rPr>
+          <w:rFonts w:ascii="Arial" w:hAnsi="Arial" w:cs="Arial"/>
+          <w:lang w:val="es-VE"/>
+        </w:rPr>
+      </w:pPr>
+      <w:r>
+        <w:rPr>
+          <w:rFonts w:ascii="Arial" w:hAnsi="Arial" w:cs="Arial"/>
+          <w:lang w:val="es-VE"/>
+        </w:rPr>
+        <w:t xml:space="preserve">Conectividad: _______ / 3</w:t>
+      </w:r>
+      <w:r>
+        <w:rPr>
+          <w:rFonts w:ascii="Arial" w:hAnsi="Arial" w:cs="Arial"/>
+          <w:lang w:val="es-VE"/>
+        </w:rPr>
+        <w:br/>
+        <w:t xml:space="preserve">(3 = fibra óptica, estable, gratuito; 2 = internet intermitente; 1 = solo datos móviles; 0 = sin internet)</w:t>
+      </w:r>
+      <w:r>
+        <w:rPr>
+          <w:rFonts w:ascii="Arial" w:hAnsi="Arial" w:cs="Arial"/>
+          <w:lang w:val="es-VE"/>
+        </w:rPr>
+      </w:r>
+      <w:r>
+        <w:rPr>
+          <w:rFonts w:ascii="Arial" w:hAnsi="Arial" w:cs="Arial"/>
+          <w:lang w:val="es-VE"/>
+        </w:rPr>
+      </w:r>
+    </w:p>
+    <w:p>
+      <w:pPr>
+        <w:pStyle w:val="891"/>
+        <w:pBdr/>
+        <w:spacing/>
+        <w:ind/>
+        <w:rPr>
+          <w:rFonts w:ascii="Arial" w:hAnsi="Arial" w:cs="Arial"/>
+          <w:lang w:val="es-VE"/>
+        </w:rPr>
+      </w:pPr>
+      <w:r>
+        <w:rPr>
+          <w:rFonts w:ascii="Arial" w:hAnsi="Arial" w:cs="Arial"/>
+          <w:lang w:val="es-VE"/>
+        </w:rPr>
+        <w:t xml:space="preserve">Operatividad: _______ / 3</w:t>
+      </w:r>
+      <w:r>
+        <w:rPr>
+          <w:rFonts w:ascii="Arial" w:hAnsi="Arial" w:cs="Arial"/>
+          <w:lang w:val="es-VE"/>
+        </w:rPr>
+        <w:br/>
+        <w:t xml:space="preserve">(3 = funciona con horario extendido; 2 = funciona con horario limitado; 1 = funciona esporádicamente; 0 = cerrado)</w:t>
+      </w:r>
+      <w:r>
+        <w:rPr>
+          <w:rFonts w:ascii="Arial" w:hAnsi="Arial" w:cs="Arial"/>
+          <w:lang w:val="es-VE"/>
+        </w:rPr>
+      </w:r>
+      <w:r>
+        <w:rPr>
+          <w:rFonts w:ascii="Arial" w:hAnsi="Arial" w:cs="Arial"/>
+          <w:lang w:val="es-VE"/>
+        </w:rPr>
+      </w:r>
+    </w:p>
+    <w:p>
+      <w:pPr>
+        <w:pStyle w:val="891"/>
+        <w:pBdr/>
+        <w:spacing/>
+        <w:ind/>
+        <w:rPr>
+          <w:rFonts w:ascii="Arial" w:hAnsi="Arial" w:cs="Arial"/>
+          <w:lang w:val="es-VE"/>
+        </w:rPr>
+      </w:pPr>
+      <w:r>
+        <w:rPr>
+          <w:rFonts w:ascii="Arial" w:hAnsi="Arial" w:cs="Arial"/>
+          <w:lang w:val="es-VE"/>
+        </w:rPr>
+        <w:t xml:space="preserve">Facilitadores: _______ / 3</w:t>
+      </w:r>
+      <w:r>
+        <w:rPr>
+          <w:rFonts w:ascii="Arial" w:hAnsi="Arial" w:cs="Arial"/>
+          <w:lang w:val="es-VE"/>
+        </w:rPr>
+        <w:br/>
+        <w:t xml:space="preserve">(3 = 2+ facilitadores con formación en ciencia/TIC; 2 = 1 facilitador con formación; 1 = facilitador sin formación específica; 0 = sin facilitador)</w:t>
+      </w:r>
+      <w:r>
+        <w:rPr>
+          <w:rFonts w:ascii="Arial" w:hAnsi="Arial" w:cs="Arial"/>
+          <w:lang w:val="es-VE"/>
+        </w:rPr>
+      </w:r>
+      <w:r>
+        <w:rPr>
+          <w:rFonts w:ascii="Arial" w:hAnsi="Arial" w:cs="Arial"/>
+          <w:lang w:val="es-VE"/>
+        </w:rPr>
+      </w:r>
+    </w:p>
+    <w:p>
+      <w:pPr>
+        <w:pStyle w:val="891"/>
+        <w:pBdr/>
+        <w:spacing/>
+        <w:ind/>
+        <w:rPr>
+          <w:rFonts w:ascii="Arial" w:hAnsi="Arial" w:cs="Arial"/>
+          <w:lang w:val="es-VE"/>
+        </w:rPr>
+      </w:pPr>
+      <w:r>
+        <w:rPr>
+          <w:rFonts w:ascii="Arial" w:hAnsi="Arial" w:cs="Arial"/>
+          <w:lang w:val="es-VE"/>
+        </w:rPr>
+        <w:t xml:space="preserve">Equipamiento: _______ / 3</w:t>
+      </w:r>
+      <w:r>
+        <w:rPr>
+          <w:rFonts w:ascii="Arial" w:hAnsi="Arial" w:cs="Arial"/>
+          <w:lang w:val="es-VE"/>
+        </w:rPr>
+        <w:br/>
+        <w:t xml:space="preserve">(3 = computadoras funcionales + equipamiento científico; 2 = computadoras funcionales; 1 = computadoras parciales; 0 = sin equipamiento)</w:t>
+      </w:r>
+      <w:r>
+        <w:rPr>
+          <w:rFonts w:ascii="Arial" w:hAnsi="Arial" w:cs="Arial"/>
+          <w:lang w:val="es-VE"/>
+        </w:rPr>
+      </w:r>
+      <w:r>
+        <w:rPr>
+          <w:rFonts w:ascii="Arial" w:hAnsi="Arial" w:cs="Arial"/>
+          <w:lang w:val="es-VE"/>
+        </w:rPr>
+      </w:r>
+    </w:p>
+    <w:p>
+      <w:pPr>
+        <w:pStyle w:val="891"/>
+        <w:pBdr/>
+        <w:spacing/>
+        <w:ind/>
+        <w:rPr>
+          <w:rFonts w:ascii="Arial" w:hAnsi="Arial" w:cs="Arial"/>
+          <w:lang w:val="es-VE"/>
+        </w:rPr>
+      </w:pPr>
+      <w:r>
+        <w:rPr>
+          <w:rFonts w:ascii="Arial" w:hAnsi="Arial" w:cs="Arial"/>
+          <w:lang w:val="es-VE"/>
+        </w:rPr>
+        <w:t xml:space="preserve">Articulación comunitaria: _______ / 3</w:t>
+      </w:r>
+      <w:r>
+        <w:rPr>
+          <w:rFonts w:ascii="Arial" w:hAnsi="Arial" w:cs="Arial"/>
+          <w:lang w:val="es-VE"/>
+        </w:rPr>
+        <w:br/>
+        <w:t xml:space="preserve">(3 = vinculado activamente con sala de autogobierno, consejos comunales y consultas populares; 2 = vinculado con algunos; 1 = vinculación pasiva; 0 = sin vinculación)</w:t>
+      </w:r>
+      <w:r>
+        <w:rPr>
+          <w:rFonts w:ascii="Arial" w:hAnsi="Arial" w:cs="Arial"/>
+          <w:lang w:val="es-VE"/>
+        </w:rPr>
+      </w:r>
+      <w:r>
+        <w:rPr>
+          <w:rFonts w:ascii="Arial" w:hAnsi="Arial" w:cs="Arial"/>
+          <w:lang w:val="es-VE"/>
+        </w:rPr>
+      </w:r>
+    </w:p>
+    <w:p>
+      <w:pPr>
+        <w:pStyle w:val="891"/>
+        <w:pBdr/>
+        <w:spacing/>
+        <w:ind/>
+        <w:rPr>
+          <w:rFonts w:ascii="Arial" w:hAnsi="Arial" w:cs="Arial"/>
+          <w:lang w:val="es-VE"/>
+        </w:rPr>
+      </w:pPr>
+      <w:r>
+        <w:rPr>
+          <w:rFonts w:ascii="Arial" w:hAnsi="Arial" w:cs="Arial"/>
+          <w:lang w:val="es-VE"/>
+        </w:rPr>
+        <w:t xml:space="preserve">Oferta formativa: _______ / 3</w:t>
+      </w:r>
+      <w:r>
+        <w:rPr>
+          <w:rFonts w:ascii="Arial" w:hAnsi="Arial" w:cs="Arial"/>
+          <w:lang w:val="es-VE"/>
+        </w:rPr>
+        <w:br/>
+        <w:t xml:space="preserve">(3 = ofrece 4+ tipos de actividades con regularidad; 2 = ofrece 2-3 actividades; 1 = ofrece 1 actividad; 0 = sin actividades formativas)</w:t>
+      </w:r>
+      <w:r>
+        <w:rPr>
+          <w:rFonts w:ascii="Arial" w:hAnsi="Arial" w:cs="Arial"/>
+          <w:lang w:val="es-VE"/>
+        </w:rPr>
+      </w:r>
+      <w:r>
+        <w:rPr>
+          <w:rFonts w:ascii="Arial" w:hAnsi="Arial" w:cs="Arial"/>
+          <w:lang w:val="es-VE"/>
+        </w:rPr>
+      </w:r>
+    </w:p>
+    <w:p>
+      <w:pPr>
+        <w:pStyle w:val="891"/>
+        <w:pBdr/>
+        <w:spacing/>
+        <w:ind/>
+        <w:rPr>
+          <w:rFonts w:ascii="Arial" w:hAnsi="Arial" w:cs="Arial"/>
+          <w:lang w:val="es-VE"/>
+        </w:rPr>
+      </w:pPr>
+      <w:r>
+        <w:rPr>
+          <w:rFonts w:ascii="Arial" w:hAnsi="Arial" w:cs="Arial"/>
+          <w:lang w:val="es-VE"/>
+        </w:rPr>
+        <w:t xml:space="preserve">Vinculación con </w:t>
+      </w:r>
+      <w:r>
+        <w:rPr>
+          <w:rFonts w:ascii="Arial" w:hAnsi="Arial" w:cs="Arial"/>
+          <w:lang w:val="es-VE"/>
+        </w:rPr>
+        <w:t xml:space="preserve">Mincyt</w:t>
+      </w:r>
+      <w:r>
+        <w:rPr>
+          <w:rFonts w:ascii="Arial" w:hAnsi="Arial" w:cs="Arial"/>
+          <w:lang w:val="es-VE"/>
+        </w:rPr>
+        <w:t xml:space="preserve">: _______ / 3</w:t>
+      </w:r>
+      <w:r>
+        <w:rPr>
+          <w:rFonts w:ascii="Arial" w:hAnsi="Arial" w:cs="Arial"/>
+          <w:lang w:val="es-VE"/>
+        </w:rPr>
+        <w:br/>
+        <w:t xml:space="preserve">(3 = vinculado activo con </w:t>
+      </w:r>
+      <w:r>
+        <w:rPr>
+          <w:rFonts w:ascii="Arial" w:hAnsi="Arial" w:cs="Arial"/>
+          <w:lang w:val="es-VE"/>
+        </w:rPr>
+        <w:t xml:space="preserve">Fundacite</w:t>
+      </w:r>
+      <w:r>
+        <w:rPr>
+          <w:rFonts w:ascii="Arial" w:hAnsi="Arial" w:cs="Arial"/>
+          <w:lang w:val="es-VE"/>
+        </w:rPr>
+        <w:t xml:space="preserve"> y programas del </w:t>
+      </w:r>
+      <w:r>
+        <w:rPr>
+          <w:rFonts w:ascii="Arial" w:hAnsi="Arial" w:cs="Arial"/>
+          <w:lang w:val="es-VE"/>
+        </w:rPr>
+        <w:t xml:space="preserve">Mincyt</w:t>
+      </w:r>
+      <w:r>
+        <w:rPr>
+          <w:rFonts w:ascii="Arial" w:hAnsi="Arial" w:cs="Arial"/>
+          <w:lang w:val="es-VE"/>
+        </w:rPr>
+        <w:t xml:space="preserve">; 2 = vinculación esporádica; 1 = conoce pero no vincula; 0 = sin conocimiento)</w:t>
+      </w:r>
+      <w:r>
+        <w:rPr>
+          <w:rFonts w:ascii="Arial" w:hAnsi="Arial" w:cs="Arial"/>
+          <w:lang w:val="es-VE"/>
+        </w:rPr>
+      </w:r>
+      <w:r>
+        <w:rPr>
+          <w:rFonts w:ascii="Arial" w:hAnsi="Arial" w:cs="Arial"/>
+          <w:lang w:val="es-VE"/>
+        </w:rPr>
+      </w:r>
+    </w:p>
+    <w:p>
+      <w:pPr>
+        <w:pStyle w:val="891"/>
+        <w:pBdr/>
+        <w:spacing/>
+        <w:ind/>
+        <w:rPr>
+          <w:rFonts w:ascii="Arial" w:hAnsi="Arial" w:cs="Arial"/>
+          <w:lang w:val="es-VE"/>
+        </w:rPr>
+      </w:pPr>
+      <w:r>
+        <w:rPr>
+          <w:rFonts w:ascii="Arial" w:hAnsi="Arial" w:cs="Arial"/>
+          <w:lang w:val="es-VE"/>
+        </w:rPr>
+        <w:t xml:space="preserve">TOTAL: _______ / 21</w:t>
+      </w:r>
+      <w:r>
+        <w:rPr>
+          <w:rFonts w:ascii="Arial" w:hAnsi="Arial" w:cs="Arial"/>
+          <w:lang w:val="es-VE"/>
+        </w:rPr>
+      </w:r>
+      <w:r>
+        <w:rPr>
+          <w:rFonts w:ascii="Arial" w:hAnsi="Arial" w:cs="Arial"/>
+          <w:lang w:val="es-VE"/>
+        </w:rPr>
+      </w:r>
+    </w:p>
+    <w:p>
+      <w:pPr>
+        <w:pStyle w:val="891"/>
+        <w:pBdr/>
+        <w:spacing/>
+        <w:ind/>
+        <w:rPr>
+          <w:rFonts w:ascii="Arial" w:hAnsi="Arial" w:cs="Arial"/>
+          <w:lang w:val="es-VE"/>
+        </w:rPr>
+      </w:pPr>
+      <w:r>
+        <w:rPr>
+          <w:rFonts w:ascii="Arial" w:hAnsi="Arial" w:cs="Arial"/>
+          <w:lang w:val="es-VE"/>
+        </w:rPr>
+        <w:t xml:space="preserve">CLASIFICACIÓN DEL INFOCENTRO</w:t>
+      </w:r>
+      <w:r>
+        <w:rPr>
+          <w:rFonts w:ascii="Arial" w:hAnsi="Arial" w:cs="Arial"/>
+          <w:lang w:val="es-VE"/>
+        </w:rPr>
+      </w:r>
+      <w:r>
+        <w:rPr>
+          <w:rFonts w:ascii="Arial" w:hAnsi="Arial" w:cs="Arial"/>
+          <w:lang w:val="es-VE"/>
+        </w:rPr>
+      </w:r>
+    </w:p>
+    <w:p>
+      <w:pPr>
+        <w:pStyle w:val="891"/>
+        <w:pBdr/>
+        <w:spacing/>
+        <w:ind/>
+        <w:rPr>
+          <w:rFonts w:ascii="Arial" w:hAnsi="Arial" w:cs="Arial"/>
+        </w:rPr>
+      </w:pPr>
+      <w:r>
+        <w:rPr>
+          <w:rFonts w:ascii="Arial" w:hAnsi="Arial" w:cs="Arial"/>
+          <w:lang w:val="es-VE"/>
+        </w:rPr>
+        <w:t xml:space="preserve">( ) TIPO A – NÚCLEO PILOTO (15-21 puntos)</w:t>
+      </w:r>
+      <w:r>
+        <w:rPr>
+          <w:rFonts w:ascii="Arial" w:hAnsi="Arial" w:cs="Arial"/>
+          <w:lang w:val="es-VE"/>
+        </w:rPr>
+        <w:br/>
+      </w:r>
+      <w:r>
+        <w:rPr>
+          <w:rFonts w:ascii="Arial" w:hAnsi="Arial" w:cs="Arial"/>
+          <w:lang w:val="es-VE"/>
+        </w:rPr>
+        <w:t xml:space="preserve">Infocentro</w:t>
+      </w:r>
+      <w:r>
+        <w:rPr>
+          <w:rFonts w:ascii="Arial" w:hAnsi="Arial" w:cs="Arial"/>
+          <w:lang w:val="es-VE"/>
+        </w:rPr>
+        <w:t xml:space="preserve"> operativo, con conectividad, facilitadores formados,</w:t>
+      </w:r>
+      <w:r>
+        <w:rPr>
+          <w:rFonts w:ascii="Arial" w:hAnsi="Arial" w:cs="Arial"/>
+          <w:lang w:val="es-VE"/>
+        </w:rPr>
+        <w:br/>
+        <w:t xml:space="preserve">equipamiento suficiente y articulación comunitaria activa.</w:t>
+      </w:r>
+      <w:r>
+        <w:rPr>
+          <w:rFonts w:ascii="Arial" w:hAnsi="Arial" w:cs="Arial"/>
+          <w:lang w:val="es-VE"/>
+        </w:rPr>
+        <w:br/>
+      </w:r>
+      <w:r>
+        <w:rPr>
+          <w:rFonts w:ascii="Arial" w:hAnsi="Arial" w:cs="Arial"/>
+        </w:rPr>
+        <w:t xml:space="preserve">Intervención</w:t>
+      </w:r>
+      <w:r>
+        <w:rPr>
+          <w:rFonts w:ascii="Arial" w:hAnsi="Arial" w:cs="Arial"/>
+        </w:rPr>
+        <w:t xml:space="preserve">: </w:t>
+      </w:r>
+      <w:r>
+        <w:rPr>
+          <w:rFonts w:ascii="Arial" w:hAnsi="Arial" w:cs="Arial"/>
+        </w:rPr>
+        <w:t xml:space="preserve">oferta</w:t>
+      </w:r>
+      <w:r>
+        <w:rPr>
+          <w:rFonts w:ascii="Arial" w:hAnsi="Arial" w:cs="Arial"/>
+        </w:rPr>
+        <w:t xml:space="preserve"> </w:t>
+      </w:r>
+      <w:r>
+        <w:rPr>
+          <w:rFonts w:ascii="Arial" w:hAnsi="Arial" w:cs="Arial"/>
+        </w:rPr>
+        <w:t xml:space="preserve">completa</w:t>
+      </w:r>
+      <w:r>
+        <w:rPr>
+          <w:rFonts w:ascii="Arial" w:hAnsi="Arial" w:cs="Arial"/>
+        </w:rPr>
+        <w:t xml:space="preserve"> </w:t>
+      </w:r>
+      <w:r>
+        <w:rPr>
+          <w:rFonts w:ascii="Arial" w:hAnsi="Arial" w:cs="Arial"/>
+        </w:rPr>
+        <w:t xml:space="preserve">del</w:t>
+      </w:r>
+      <w:r>
+        <w:rPr>
+          <w:rFonts w:ascii="Arial" w:hAnsi="Arial" w:cs="Arial"/>
+        </w:rPr>
+        <w:t xml:space="preserve"> </w:t>
+      </w:r>
+      <w:r>
+        <w:rPr>
+          <w:rFonts w:ascii="Arial" w:hAnsi="Arial" w:cs="Arial"/>
+        </w:rPr>
+        <w:t xml:space="preserve">Programa</w:t>
+      </w:r>
+      <w:r>
+        <w:rPr>
+          <w:rFonts w:ascii="Arial" w:hAnsi="Arial" w:cs="Arial"/>
+        </w:rPr>
+        <w:t xml:space="preserve"> ENLACE.</w:t>
+      </w:r>
+      <w:r>
+        <w:rPr>
+          <w:rFonts w:ascii="Arial" w:hAnsi="Arial" w:cs="Arial"/>
+        </w:rPr>
+      </w:r>
+      <w:r>
+        <w:rPr>
+          <w:rFonts w:ascii="Arial" w:hAnsi="Arial" w:cs="Arial"/>
+        </w:rPr>
+      </w:r>
+    </w:p>
+    <w:p>
+      <w:pPr>
+        <w:pStyle w:val="891"/>
+        <w:pBdr/>
+        <w:spacing/>
+        <w:ind/>
+        <w:rPr>
+          <w:rFonts w:ascii="Arial" w:hAnsi="Arial" w:cs="Arial"/>
+          <w:lang w:val="es-VE"/>
+        </w:rPr>
+      </w:pPr>
+      <w:r>
+        <w:rPr>
+          <w:rFonts w:ascii="Arial" w:hAnsi="Arial" w:cs="Arial"/>
+          <w:lang w:val="es-VE"/>
+        </w:rPr>
+        <w:t xml:space="preserve">( ) TIPO B – EN CONSOLIDACIÓN (8-14 puntos)</w:t>
+      </w:r>
+      <w:r>
+        <w:rPr>
+          <w:rFonts w:ascii="Arial" w:hAnsi="Arial" w:cs="Arial"/>
+          <w:lang w:val="es-VE"/>
+        </w:rPr>
+        <w:br/>
+      </w:r>
+      <w:r>
+        <w:rPr>
+          <w:rFonts w:ascii="Arial" w:hAnsi="Arial" w:cs="Arial"/>
+          <w:lang w:val="es-VE"/>
+        </w:rPr>
+        <w:t xml:space="preserve">Infocentro</w:t>
+      </w:r>
+      <w:r>
+        <w:rPr>
+          <w:rFonts w:ascii="Arial" w:hAnsi="Arial" w:cs="Arial"/>
+          <w:lang w:val="es-VE"/>
+        </w:rPr>
+        <w:t xml:space="preserve"> parcialmente operativo, con limitaciones en conectividad,</w:t>
+      </w:r>
+      <w:r>
+        <w:rPr>
+          <w:rFonts w:ascii="Arial" w:hAnsi="Arial" w:cs="Arial"/>
+          <w:lang w:val="es-VE"/>
+        </w:rPr>
+        <w:br/>
+        <w:t xml:space="preserve">equipamiento o facilitadores, pero con potencial comunitario.</w:t>
+      </w:r>
+      <w:r>
+        <w:rPr>
+          <w:rFonts w:ascii="Arial" w:hAnsi="Arial" w:cs="Arial"/>
+          <w:lang w:val="es-VE"/>
+        </w:rPr>
+        <w:br/>
+      </w:r>
+      <w:r>
+        <w:rPr>
+          <w:rFonts w:ascii="Arial" w:hAnsi="Arial" w:cs="Arial"/>
+          <w:lang w:val="es-VE"/>
+        </w:rPr>
+        <w:t xml:space="preserve">Intervención: priorizar formación para adultos mayores, apoyo a</w:t>
+      </w:r>
+      <w:r>
+        <w:rPr>
+          <w:rFonts w:ascii="Arial" w:hAnsi="Arial" w:cs="Arial"/>
+          <w:lang w:val="es-VE"/>
+        </w:rPr>
+        <w:br/>
+        <w:t xml:space="preserve">salas de autogobierno y contenidos científicos offline.</w:t>
+      </w:r>
+      <w:r>
+        <w:rPr>
+          <w:rFonts w:ascii="Arial" w:hAnsi="Arial" w:cs="Arial"/>
+          <w:lang w:val="es-VE"/>
+        </w:rPr>
+      </w:r>
+      <w:r>
+        <w:rPr>
+          <w:rFonts w:ascii="Arial" w:hAnsi="Arial" w:cs="Arial"/>
+          <w:lang w:val="es-VE"/>
+        </w:rPr>
+      </w:r>
+    </w:p>
+    <w:p>
+      <w:pPr>
+        <w:pStyle w:val="891"/>
+        <w:pBdr/>
+        <w:spacing/>
+        <w:ind/>
+        <w:rPr>
+          <w:rFonts w:ascii="Arial" w:hAnsi="Arial" w:cs="Arial"/>
+          <w:lang w:val="es-VE"/>
+        </w:rPr>
+      </w:pPr>
+      <w:r>
+        <w:rPr>
+          <w:rFonts w:ascii="Arial" w:hAnsi="Arial" w:cs="Arial"/>
+          <w:lang w:val="es-VE"/>
+        </w:rPr>
+        <w:t xml:space="preserve">( ) TIPO C – POR RECUPERAR (0-7 puntos)</w:t>
+      </w:r>
+      <w:r>
+        <w:rPr>
+          <w:rFonts w:ascii="Arial" w:hAnsi="Arial" w:cs="Arial"/>
+          <w:lang w:val="es-VE"/>
+        </w:rPr>
+        <w:br/>
+      </w:r>
+      <w:r>
+        <w:rPr>
+          <w:rFonts w:ascii="Arial" w:hAnsi="Arial" w:cs="Arial"/>
+          <w:lang w:val="es-VE"/>
+        </w:rPr>
+        <w:t xml:space="preserve">Infocentro</w:t>
+      </w:r>
+      <w:r>
+        <w:rPr>
+          <w:rFonts w:ascii="Arial" w:hAnsi="Arial" w:cs="Arial"/>
+          <w:lang w:val="es-VE"/>
+        </w:rPr>
+        <w:t xml:space="preserve"> inoperativo o con graves limitaciones.</w:t>
+      </w:r>
+      <w:r>
+        <w:rPr>
+          <w:rFonts w:ascii="Arial" w:hAnsi="Arial" w:cs="Arial"/>
+          <w:lang w:val="es-VE"/>
+        </w:rPr>
+        <w:br/>
+        <w:t xml:space="preserve">Intervención: espacio de encuentro presencial y asambleas de ciencia</w:t>
+      </w:r>
+      <w:r>
+        <w:rPr>
+          <w:rFonts w:ascii="Arial" w:hAnsi="Arial" w:cs="Arial"/>
+          <w:lang w:val="es-VE"/>
+        </w:rPr>
+        <w:br/>
+        <w:t xml:space="preserve">ciudadana; articulación con CANTV, </w:t>
+      </w:r>
+      <w:r>
+        <w:rPr>
+          <w:rFonts w:ascii="Arial" w:hAnsi="Arial" w:cs="Arial"/>
+          <w:lang w:val="es-VE"/>
+        </w:rPr>
+        <w:t xml:space="preserve">Corpoelec</w:t>
+      </w:r>
+      <w:r>
+        <w:rPr>
+          <w:rFonts w:ascii="Arial" w:hAnsi="Arial" w:cs="Arial"/>
+          <w:lang w:val="es-VE"/>
+        </w:rPr>
+        <w:t xml:space="preserve"> y el Poder Popular</w:t>
+      </w:r>
+      <w:r>
+        <w:rPr>
+          <w:rFonts w:ascii="Arial" w:hAnsi="Arial" w:cs="Arial"/>
+          <w:lang w:val="es-VE"/>
+        </w:rPr>
+        <w:br/>
+        <w:t xml:space="preserve">para rehabilitación física y tecnológica.</w:t>
+      </w:r>
+      <w:r>
+        <w:rPr>
+          <w:rFonts w:ascii="Arial" w:hAnsi="Arial" w:cs="Arial"/>
+          <w:lang w:val="es-VE"/>
+        </w:rPr>
+      </w:r>
+      <w:r>
+        <w:rPr>
+          <w:rFonts w:ascii="Arial" w:hAnsi="Arial" w:cs="Arial"/>
+          <w:lang w:val="es-VE"/>
+        </w:rPr>
+      </w:r>
+    </w:p>
+    <w:p>
+      <w:pPr>
+        <w:pStyle w:val="891"/>
+        <w:pBdr/>
+        <w:spacing/>
+        <w:ind/>
+        <w:rPr>
+          <w:rFonts w:ascii="Arial" w:hAnsi="Arial" w:cs="Arial"/>
+          <w:lang w:val="es-VE"/>
+        </w:rPr>
+      </w:pPr>
+      <w:r>
+        <w:rPr>
+          <w:rFonts w:ascii="Arial" w:hAnsi="Arial" w:cs="Arial"/>
+          <w:lang w:val="es-VE"/>
+        </w:rPr>
+        <w:t xml:space="preserve">J.3. PRIORIDAD DE INTERVENCIÓN</w:t>
+      </w:r>
+      <w:r>
+        <w:rPr>
+          <w:rFonts w:ascii="Arial" w:hAnsi="Arial" w:cs="Arial"/>
+          <w:lang w:val="es-VE"/>
+        </w:rPr>
+      </w:r>
+      <w:r>
+        <w:rPr>
+          <w:rFonts w:ascii="Arial" w:hAnsi="Arial" w:cs="Arial"/>
+          <w:lang w:val="es-VE"/>
+        </w:rPr>
+      </w:r>
+    </w:p>
+    <w:p>
+      <w:pPr>
+        <w:pStyle w:val="891"/>
+        <w:pBdr/>
+        <w:spacing/>
+        <w:ind/>
+        <w:rPr>
+          <w:rFonts w:ascii="Arial" w:hAnsi="Arial" w:cs="Arial"/>
+          <w:lang w:val="es-VE"/>
+        </w:rPr>
+      </w:pPr>
+      <w:r>
+        <w:rPr>
+          <w:rFonts w:ascii="Arial" w:hAnsi="Arial" w:cs="Arial"/>
+          <w:lang w:val="es-VE"/>
+        </w:rPr>
+        <w:t xml:space="preserve">( ) Inmediata ( ) Corto plazo (3-6 meses) ( ) Mediano plazo (6-12 meses)</w:t>
+      </w:r>
+      <w:r>
+        <w:rPr>
+          <w:rFonts w:ascii="Arial" w:hAnsi="Arial" w:cs="Arial"/>
+          <w:lang w:val="es-VE"/>
+        </w:rPr>
+      </w:r>
+      <w:r>
+        <w:rPr>
+          <w:rFonts w:ascii="Arial" w:hAnsi="Arial" w:cs="Arial"/>
+          <w:lang w:val="es-VE"/>
+        </w:rPr>
+      </w:r>
+    </w:p>
+    <w:p>
+      <w:pPr>
+        <w:pStyle w:val="891"/>
+        <w:pBdr/>
+        <w:spacing/>
+        <w:ind/>
+        <w:rPr>
+          <w:rFonts w:ascii="Arial" w:hAnsi="Arial" w:cs="Arial"/>
+          <w:lang w:val="es-VE"/>
+        </w:rPr>
+      </w:pPr>
+      <w:r>
+        <w:rPr>
+          <w:rFonts w:ascii="Arial" w:hAnsi="Arial" w:cs="Arial"/>
+          <w:lang w:val="es-VE"/>
+        </w:rPr>
+        <w:t xml:space="preserve">J.4. RECOMENDACIONES ESPECÍFICAS PARA ESTE INFOCENTRO:</w:t>
+      </w:r>
+      <w:r>
+        <w:rPr>
+          <w:rFonts w:ascii="Arial" w:hAnsi="Arial" w:cs="Arial"/>
+          <w:lang w:val="es-VE"/>
+        </w:rPr>
+        <w:br/>
+        <w:t xml:space="preserve">_________________________________________________________________</w:t>
+      </w:r>
+      <w:r>
+        <w:rPr>
+          <w:rFonts w:ascii="Arial" w:hAnsi="Arial" w:cs="Arial"/>
+          <w:lang w:val="es-VE"/>
+        </w:rPr>
+        <w:br/>
+        <w:t xml:space="preserve">_________________________________________________________________</w:t>
+      </w:r>
+      <w:r>
+        <w:rPr>
+          <w:rFonts w:ascii="Arial" w:hAnsi="Arial" w:cs="Arial"/>
+          <w:lang w:val="es-VE"/>
+        </w:rPr>
+        <w:br/>
+        <w:t xml:space="preserve">_________________________________________________________________</w:t>
+      </w:r>
+      <w:r>
+        <w:rPr>
+          <w:rFonts w:ascii="Arial" w:hAnsi="Arial" w:cs="Arial"/>
+          <w:lang w:val="es-VE"/>
+        </w:rPr>
+        <w:br/>
+        <w:t xml:space="preserve">_________________________________________________________________</w:t>
       </w:r>
       <w:r>
         <w:rPr>

</xml_diff>